<commit_message>
Blanche confirmed - scorecard updated
</commit_message>
<xml_diff>
--- a/reports/scorecards/AFG_Scorecard_2026-08-10.docx
+++ b/reports/scorecards/AFG_Scorecard_2026-08-10.docx
@@ -102,7 +102,7 @@
                 <w:color w:val="17365D"/>
                 <w:sz w:val="44"/>
               </w:rPr>
-              <w:t>4</w:t>
+              <w:t>5</w:t>
             </w:r>
           </w:p>
           <w:p>
@@ -192,7 +192,7 @@
                 <w:color w:val="A6231F"/>
                 <w:sz w:val="44"/>
               </w:rPr>
-              <w:t>1</w:t>
+              <w:t>2</w:t>
             </w:r>
           </w:p>
           <w:p>
@@ -237,7 +237,7 @@
                 <w:color w:val="17365D"/>
                 <w:sz w:val="44"/>
               </w:rPr>
-              <w:t>0.135</w:t>
+              <w:t>0.111</w:t>
             </w:r>
           </w:p>
           <w:p>
@@ -282,7 +282,7 @@
           <w:color w:val="17365D"/>
           <w:sz w:val="26"/>
         </w:rPr>
-        <w:t>75%</w:t>
+        <w:t>60%</w:t>
       </w:r>
       <w:r>
         <w:rPr>
@@ -322,7 +322,7 @@
           <w:color w:val="808080"/>
           <w:sz w:val="19"/>
         </w:rPr>
-        <w:t xml:space="preserve">  (Market Brier: 0.156)</w:t>
+        <w:t xml:space="preserve">  (Market Brier: 0.132)</w:t>
       </w:r>
     </w:p>
     <w:p>
@@ -905,7 +905,7 @@
                 <w:color w:val="808080"/>
                 <w:sz w:val="19"/>
               </w:rPr>
-              <w:t>—</w:t>
+              <w:t>1</w:t>
             </w:r>
           </w:p>
         </w:tc>
@@ -929,10 +929,10 @@
                 <w:rFonts w:ascii="Cambria" w:hAnsi="Cambria"/>
                 <w:b w:val="0"/>
                 <w:i w:val="0"/>
-                <w:color w:val="808080"/>
+                <w:color w:val="1F6F3D"/>
                 <w:sz w:val="19"/>
               </w:rPr>
-              <w:t>—</w:t>
+              <w:t>0</w:t>
             </w:r>
           </w:p>
         </w:tc>
@@ -956,10 +956,10 @@
                 <w:rFonts w:ascii="Cambria" w:hAnsi="Cambria"/>
                 <w:b w:val="0"/>
                 <w:i w:val="0"/>
-                <w:color w:val="808080"/>
+                <w:color w:val="A6231F"/>
                 <w:sz w:val="19"/>
               </w:rPr>
-              <w:t>—</w:t>
+              <w:t>1</w:t>
             </w:r>
           </w:p>
         </w:tc>
@@ -983,10 +983,10 @@
                 <w:rFonts w:ascii="Cambria" w:hAnsi="Cambria"/>
                 <w:b w:val="0"/>
                 <w:i w:val="0"/>
-                <w:color w:val="808080"/>
+                <w:color w:val="17365D"/>
                 <w:sz w:val="19"/>
               </w:rPr>
-              <w:t>—</w:t>
+              <w:t>0%</w:t>
             </w:r>
           </w:p>
         </w:tc>
@@ -1010,10 +1010,10 @@
                 <w:rFonts w:ascii="Cambria" w:hAnsi="Cambria"/>
                 <w:b w:val="0"/>
                 <w:i w:val="0"/>
-                <w:color w:val="808080"/>
+                <w:color w:val="17365D"/>
                 <w:sz w:val="19"/>
               </w:rPr>
-              <w:t>—</w:t>
+              <w:t>0.014</w:t>
             </w:r>
           </w:p>
         </w:tc>
@@ -2341,6 +2341,197 @@
           </w:p>
         </w:tc>
       </w:tr>
+      <w:tr>
+        <w:tc>
+          <w:tcPr>
+            <w:tcBorders>
+              <w:top w:val="single" w:sz="2" w:color="B0B8C8"/>
+              <w:left w:val="single" w:sz="2" w:color="B0B8C8"/>
+              <w:bottom w:val="single" w:sz="2" w:color="B0B8C8"/>
+              <w:right w:val="single" w:sz="2" w:color="B0B8C8"/>
+            </w:tcBorders>
+            <w:tcW w:w="3500" w:type="dxa"/>
+          </w:tcPr>
+          <w:p>
+            <w:pPr>
+              <w:spacing w:before="60" w:after="60"/>
+            </w:pPr>
+            <w:r/>
+            <w:r>
+              <w:rPr>
+                <w:rFonts w:ascii="Cambria" w:hAnsi="Cambria"/>
+                <w:b w:val="0"/>
+                <w:i w:val="0"/>
+                <w:color w:val="17365D"/>
+                <w:sz w:val="18"/>
+              </w:rPr>
+              <w:t>Trump next Attorney General — Todd Blanche</w:t>
+            </w:r>
+          </w:p>
+        </w:tc>
+        <w:tc>
+          <w:tcPr>
+            <w:tcBorders>
+              <w:top w:val="single" w:sz="2" w:color="B0B8C8"/>
+              <w:left w:val="single" w:sz="2" w:color="B0B8C8"/>
+              <w:bottom w:val="single" w:sz="2" w:color="B0B8C8"/>
+              <w:right w:val="single" w:sz="2" w:color="B0B8C8"/>
+            </w:tcBorders>
+            <w:tcW w:w="1300" w:type="dxa"/>
+          </w:tcPr>
+          <w:p>
+            <w:pPr>
+              <w:spacing w:before="60" w:after="60"/>
+            </w:pPr>
+            <w:r/>
+            <w:r>
+              <w:rPr>
+                <w:rFonts w:ascii="Cambria" w:hAnsi="Cambria"/>
+                <w:b w:val="0"/>
+                <w:i w:val="0"/>
+                <w:color w:val="808080"/>
+                <w:sz w:val="18"/>
+              </w:rPr>
+              <w:t>Politics</w:t>
+            </w:r>
+          </w:p>
+        </w:tc>
+        <w:tc>
+          <w:tcPr>
+            <w:tcBorders>
+              <w:top w:val="single" w:sz="2" w:color="B0B8C8"/>
+              <w:left w:val="single" w:sz="2" w:color="B0B8C8"/>
+              <w:bottom w:val="single" w:sz="2" w:color="B0B8C8"/>
+              <w:right w:val="single" w:sz="2" w:color="B0B8C8"/>
+            </w:tcBorders>
+            <w:tcW w:w="800" w:type="dxa"/>
+          </w:tcPr>
+          <w:p>
+            <w:pPr>
+              <w:spacing w:before="60" w:after="60"/>
+            </w:pPr>
+            <w:r/>
+            <w:r>
+              <w:rPr>
+                <w:rFonts w:ascii="Cambria" w:hAnsi="Cambria"/>
+                <w:b w:val="0"/>
+                <w:i w:val="0"/>
+                <w:color w:val="808080"/>
+                <w:sz w:val="18"/>
+              </w:rPr>
+              <w:t>65%</w:t>
+            </w:r>
+          </w:p>
+        </w:tc>
+        <w:tc>
+          <w:tcPr>
+            <w:tcBorders>
+              <w:top w:val="single" w:sz="2" w:color="B0B8C8"/>
+              <w:left w:val="single" w:sz="2" w:color="B0B8C8"/>
+              <w:bottom w:val="single" w:sz="2" w:color="B0B8C8"/>
+              <w:right w:val="single" w:sz="2" w:color="B0B8C8"/>
+            </w:tcBorders>
+            <w:tcW w:w="800" w:type="dxa"/>
+          </w:tcPr>
+          <w:p>
+            <w:pPr>
+              <w:spacing w:before="60" w:after="60"/>
+            </w:pPr>
+            <w:r/>
+            <w:r>
+              <w:rPr>
+                <w:rFonts w:ascii="Cambria" w:hAnsi="Cambria"/>
+                <w:b w:val="0"/>
+                <w:i w:val="0"/>
+                <w:color w:val="17365D"/>
+                <w:sz w:val="18"/>
+              </w:rPr>
+              <w:t>55%</w:t>
+            </w:r>
+          </w:p>
+        </w:tc>
+        <w:tc>
+          <w:tcPr>
+            <w:tcBorders>
+              <w:top w:val="single" w:sz="2" w:color="B0B8C8"/>
+              <w:left w:val="single" w:sz="2" w:color="B0B8C8"/>
+              <w:bottom w:val="single" w:sz="2" w:color="B0B8C8"/>
+              <w:right w:val="single" w:sz="2" w:color="B0B8C8"/>
+            </w:tcBorders>
+            <w:tcW w:w="1300" w:type="dxa"/>
+          </w:tcPr>
+          <w:p>
+            <w:pPr>
+              <w:spacing w:before="60" w:after="60"/>
+            </w:pPr>
+            <w:r/>
+            <w:r>
+              <w:rPr>
+                <w:rFonts w:ascii="Cambria" w:hAnsi="Cambria"/>
+                <w:b/>
+                <w:i w:val="0"/>
+                <w:color w:val="A6231F"/>
+                <w:sz w:val="18"/>
+              </w:rPr>
+              <w:t>BUY NO</w:t>
+            </w:r>
+          </w:p>
+        </w:tc>
+        <w:tc>
+          <w:tcPr>
+            <w:tcBorders>
+              <w:top w:val="single" w:sz="2" w:color="B0B8C8"/>
+              <w:left w:val="single" w:sz="2" w:color="B0B8C8"/>
+              <w:bottom w:val="single" w:sz="2" w:color="B0B8C8"/>
+              <w:right w:val="single" w:sz="2" w:color="B0B8C8"/>
+            </w:tcBorders>
+            <w:tcW w:w="1000" w:type="dxa"/>
+          </w:tcPr>
+          <w:p>
+            <w:pPr>
+              <w:spacing w:before="60" w:after="60"/>
+            </w:pPr>
+            <w:r/>
+            <w:r>
+              <w:rPr>
+                <w:rFonts w:ascii="Cambria" w:hAnsi="Cambria"/>
+                <w:b w:val="0"/>
+                <w:i w:val="0"/>
+                <w:color w:val="808080"/>
+                <w:sz w:val="18"/>
+              </w:rPr>
+              <w:t>YES</w:t>
+            </w:r>
+          </w:p>
+        </w:tc>
+        <w:tc>
+          <w:tcPr>
+            <w:tcBorders>
+              <w:top w:val="single" w:sz="2" w:color="B0B8C8"/>
+              <w:left w:val="single" w:sz="2" w:color="B0B8C8"/>
+              <w:bottom w:val="single" w:sz="2" w:color="B0B8C8"/>
+              <w:right w:val="single" w:sz="2" w:color="B0B8C8"/>
+            </w:tcBorders>
+            <w:tcW w:w="2100" w:type="dxa"/>
+          </w:tcPr>
+          <w:p>
+            <w:pPr>
+              <w:spacing w:before="60" w:after="60"/>
+            </w:pPr>
+            <w:r/>
+            <w:r>
+              <w:rPr>
+                <w:rFonts w:ascii="Cambria" w:hAnsi="Cambria"/>
+                <w:b/>
+                <w:i w:val="0"/>
+                <w:color w:val="A6231F"/>
+                <w:sz w:val="18"/>
+              </w:rPr>
+              <w:t>✗ Incorrect</w:t>
+            </w:r>
+          </w:p>
+        </w:tc>
+      </w:tr>
     </w:tbl>
     <w:p>
       <w:pPr>

</xml_diff>

<commit_message>
fix Blanche score - last call rule
</commit_message>
<xml_diff>
--- a/reports/scorecards/AFG_Scorecard_2026-08-10.docx
+++ b/reports/scorecards/AFG_Scorecard_2026-08-10.docx
@@ -147,7 +147,7 @@
                 <w:color w:val="1F6F3D"/>
                 <w:sz w:val="44"/>
               </w:rPr>
-              <w:t>3</w:t>
+              <w:t>4</w:t>
             </w:r>
           </w:p>
           <w:p>
@@ -192,7 +192,7 @@
                 <w:color w:val="A6231F"/>
                 <w:sz w:val="44"/>
               </w:rPr>
-              <w:t>2</w:t>
+              <w:t>1</w:t>
             </w:r>
           </w:p>
           <w:p>
@@ -282,7 +282,7 @@
           <w:color w:val="17365D"/>
           <w:sz w:val="26"/>
         </w:rPr>
-        <w:t>60%</w:t>
+        <w:t>80%</w:t>
       </w:r>
       <w:r>
         <w:rPr>
@@ -932,7 +932,7 @@
                 <w:color w:val="1F6F3D"/>
                 <w:sz w:val="19"/>
               </w:rPr>
-              <w:t>0</w:t>
+              <w:t>1</w:t>
             </w:r>
           </w:p>
         </w:tc>
@@ -959,7 +959,7 @@
                 <w:color w:val="A6231F"/>
                 <w:sz w:val="19"/>
               </w:rPr>
-              <w:t>1</w:t>
+              <w:t>0</w:t>
             </w:r>
           </w:p>
         </w:tc>
@@ -986,7 +986,7 @@
                 <w:color w:val="17365D"/>
                 <w:sz w:val="19"/>
               </w:rPr>
-              <w:t>0%</w:t>
+              <w:t>100%</w:t>
             </w:r>
           </w:p>
         </w:tc>
@@ -1983,6 +1983,197 @@
                 <w:color w:val="17365D"/>
                 <w:sz w:val="18"/>
               </w:rPr>
+              <w:t>Trump next Attorney General — Todd Blanche</w:t>
+            </w:r>
+          </w:p>
+        </w:tc>
+        <w:tc>
+          <w:tcPr>
+            <w:tcBorders>
+              <w:top w:val="single" w:sz="2" w:color="B0B8C8"/>
+              <w:left w:val="single" w:sz="2" w:color="B0B8C8"/>
+              <w:bottom w:val="single" w:sz="2" w:color="B0B8C8"/>
+              <w:right w:val="single" w:sz="2" w:color="B0B8C8"/>
+            </w:tcBorders>
+            <w:tcW w:w="1300" w:type="dxa"/>
+          </w:tcPr>
+          <w:p>
+            <w:pPr>
+              <w:spacing w:before="60" w:after="60"/>
+            </w:pPr>
+            <w:r/>
+            <w:r>
+              <w:rPr>
+                <w:rFonts w:ascii="Cambria" w:hAnsi="Cambria"/>
+                <w:b w:val="0"/>
+                <w:i w:val="0"/>
+                <w:color w:val="808080"/>
+                <w:sz w:val="18"/>
+              </w:rPr>
+              <w:t>Politics</w:t>
+            </w:r>
+          </w:p>
+        </w:tc>
+        <w:tc>
+          <w:tcPr>
+            <w:tcBorders>
+              <w:top w:val="single" w:sz="2" w:color="B0B8C8"/>
+              <w:left w:val="single" w:sz="2" w:color="B0B8C8"/>
+              <w:bottom w:val="single" w:sz="2" w:color="B0B8C8"/>
+              <w:right w:val="single" w:sz="2" w:color="B0B8C8"/>
+            </w:tcBorders>
+            <w:tcW w:w="800" w:type="dxa"/>
+          </w:tcPr>
+          <w:p>
+            <w:pPr>
+              <w:spacing w:before="60" w:after="60"/>
+            </w:pPr>
+            <w:r/>
+            <w:r>
+              <w:rPr>
+                <w:rFonts w:ascii="Cambria" w:hAnsi="Cambria"/>
+                <w:b w:val="0"/>
+                <w:i w:val="0"/>
+                <w:color w:val="808080"/>
+                <w:sz w:val="18"/>
+              </w:rPr>
+              <w:t>81%</w:t>
+            </w:r>
+          </w:p>
+        </w:tc>
+        <w:tc>
+          <w:tcPr>
+            <w:tcBorders>
+              <w:top w:val="single" w:sz="2" w:color="B0B8C8"/>
+              <w:left w:val="single" w:sz="2" w:color="B0B8C8"/>
+              <w:bottom w:val="single" w:sz="2" w:color="B0B8C8"/>
+              <w:right w:val="single" w:sz="2" w:color="B0B8C8"/>
+            </w:tcBorders>
+            <w:tcW w:w="800" w:type="dxa"/>
+          </w:tcPr>
+          <w:p>
+            <w:pPr>
+              <w:spacing w:before="60" w:after="60"/>
+            </w:pPr>
+            <w:r/>
+            <w:r>
+              <w:rPr>
+                <w:rFonts w:ascii="Cambria" w:hAnsi="Cambria"/>
+                <w:b w:val="0"/>
+                <w:i w:val="0"/>
+                <w:color w:val="17365D"/>
+                <w:sz w:val="18"/>
+              </w:rPr>
+              <w:t>88%</w:t>
+            </w:r>
+          </w:p>
+        </w:tc>
+        <w:tc>
+          <w:tcPr>
+            <w:tcBorders>
+              <w:top w:val="single" w:sz="2" w:color="B0B8C8"/>
+              <w:left w:val="single" w:sz="2" w:color="B0B8C8"/>
+              <w:bottom w:val="single" w:sz="2" w:color="B0B8C8"/>
+              <w:right w:val="single" w:sz="2" w:color="B0B8C8"/>
+            </w:tcBorders>
+            <w:tcW w:w="1300" w:type="dxa"/>
+          </w:tcPr>
+          <w:p>
+            <w:pPr>
+              <w:spacing w:before="60" w:after="60"/>
+            </w:pPr>
+            <w:r/>
+            <w:r>
+              <w:rPr>
+                <w:rFonts w:ascii="Cambria" w:hAnsi="Cambria"/>
+                <w:b/>
+                <w:i w:val="0"/>
+                <w:color w:val="1F6F3D"/>
+                <w:sz w:val="18"/>
+              </w:rPr>
+              <w:t>BUY YES</w:t>
+            </w:r>
+          </w:p>
+        </w:tc>
+        <w:tc>
+          <w:tcPr>
+            <w:tcBorders>
+              <w:top w:val="single" w:sz="2" w:color="B0B8C8"/>
+              <w:left w:val="single" w:sz="2" w:color="B0B8C8"/>
+              <w:bottom w:val="single" w:sz="2" w:color="B0B8C8"/>
+              <w:right w:val="single" w:sz="2" w:color="B0B8C8"/>
+            </w:tcBorders>
+            <w:tcW w:w="1000" w:type="dxa"/>
+          </w:tcPr>
+          <w:p>
+            <w:pPr>
+              <w:spacing w:before="60" w:after="60"/>
+            </w:pPr>
+            <w:r/>
+            <w:r>
+              <w:rPr>
+                <w:rFonts w:ascii="Cambria" w:hAnsi="Cambria"/>
+                <w:b w:val="0"/>
+                <w:i w:val="0"/>
+                <w:color w:val="808080"/>
+                <w:sz w:val="18"/>
+              </w:rPr>
+              <w:t>YES</w:t>
+            </w:r>
+          </w:p>
+        </w:tc>
+        <w:tc>
+          <w:tcPr>
+            <w:tcBorders>
+              <w:top w:val="single" w:sz="2" w:color="B0B8C8"/>
+              <w:left w:val="single" w:sz="2" w:color="B0B8C8"/>
+              <w:bottom w:val="single" w:sz="2" w:color="B0B8C8"/>
+              <w:right w:val="single" w:sz="2" w:color="B0B8C8"/>
+            </w:tcBorders>
+            <w:tcW w:w="2100" w:type="dxa"/>
+          </w:tcPr>
+          <w:p>
+            <w:pPr>
+              <w:spacing w:before="60" w:after="60"/>
+            </w:pPr>
+            <w:r/>
+            <w:r>
+              <w:rPr>
+                <w:rFonts w:ascii="Cambria" w:hAnsi="Cambria"/>
+                <w:b/>
+                <w:i w:val="0"/>
+                <w:color w:val="1F6F3D"/>
+                <w:sz w:val="18"/>
+              </w:rPr>
+              <w:t>✓ Correct</w:t>
+            </w:r>
+          </w:p>
+        </w:tc>
+      </w:tr>
+      <w:tr>
+        <w:tc>
+          <w:tcPr>
+            <w:tcBorders>
+              <w:top w:val="single" w:sz="2" w:color="B0B8C8"/>
+              <w:left w:val="single" w:sz="2" w:color="B0B8C8"/>
+              <w:bottom w:val="single" w:sz="2" w:color="B0B8C8"/>
+              <w:right w:val="single" w:sz="2" w:color="B0B8C8"/>
+            </w:tcBorders>
+            <w:tcW w:w="3500" w:type="dxa"/>
+          </w:tcPr>
+          <w:p>
+            <w:pPr>
+              <w:spacing w:before="60" w:after="60"/>
+            </w:pPr>
+            <w:r/>
+            <w:r>
+              <w:rPr>
+                <w:rFonts w:ascii="Cambria" w:hAnsi="Cambria"/>
+                <w:b w:val="0"/>
+                <w:i w:val="0"/>
+                <w:color w:val="17365D"/>
+                <w:sz w:val="18"/>
+              </w:rPr>
               <w:t>LeBron James Next Team — Cleveland Cavaliers</w:t>
             </w:r>
           </w:p>
@@ -2341,197 +2532,6 @@
           </w:p>
         </w:tc>
       </w:tr>
-      <w:tr>
-        <w:tc>
-          <w:tcPr>
-            <w:tcBorders>
-              <w:top w:val="single" w:sz="2" w:color="B0B8C8"/>
-              <w:left w:val="single" w:sz="2" w:color="B0B8C8"/>
-              <w:bottom w:val="single" w:sz="2" w:color="B0B8C8"/>
-              <w:right w:val="single" w:sz="2" w:color="B0B8C8"/>
-            </w:tcBorders>
-            <w:tcW w:w="3500" w:type="dxa"/>
-          </w:tcPr>
-          <w:p>
-            <w:pPr>
-              <w:spacing w:before="60" w:after="60"/>
-            </w:pPr>
-            <w:r/>
-            <w:r>
-              <w:rPr>
-                <w:rFonts w:ascii="Cambria" w:hAnsi="Cambria"/>
-                <w:b w:val="0"/>
-                <w:i w:val="0"/>
-                <w:color w:val="17365D"/>
-                <w:sz w:val="18"/>
-              </w:rPr>
-              <w:t>Trump next Attorney General — Todd Blanche</w:t>
-            </w:r>
-          </w:p>
-        </w:tc>
-        <w:tc>
-          <w:tcPr>
-            <w:tcBorders>
-              <w:top w:val="single" w:sz="2" w:color="B0B8C8"/>
-              <w:left w:val="single" w:sz="2" w:color="B0B8C8"/>
-              <w:bottom w:val="single" w:sz="2" w:color="B0B8C8"/>
-              <w:right w:val="single" w:sz="2" w:color="B0B8C8"/>
-            </w:tcBorders>
-            <w:tcW w:w="1300" w:type="dxa"/>
-          </w:tcPr>
-          <w:p>
-            <w:pPr>
-              <w:spacing w:before="60" w:after="60"/>
-            </w:pPr>
-            <w:r/>
-            <w:r>
-              <w:rPr>
-                <w:rFonts w:ascii="Cambria" w:hAnsi="Cambria"/>
-                <w:b w:val="0"/>
-                <w:i w:val="0"/>
-                <w:color w:val="808080"/>
-                <w:sz w:val="18"/>
-              </w:rPr>
-              <w:t>Politics</w:t>
-            </w:r>
-          </w:p>
-        </w:tc>
-        <w:tc>
-          <w:tcPr>
-            <w:tcBorders>
-              <w:top w:val="single" w:sz="2" w:color="B0B8C8"/>
-              <w:left w:val="single" w:sz="2" w:color="B0B8C8"/>
-              <w:bottom w:val="single" w:sz="2" w:color="B0B8C8"/>
-              <w:right w:val="single" w:sz="2" w:color="B0B8C8"/>
-            </w:tcBorders>
-            <w:tcW w:w="800" w:type="dxa"/>
-          </w:tcPr>
-          <w:p>
-            <w:pPr>
-              <w:spacing w:before="60" w:after="60"/>
-            </w:pPr>
-            <w:r/>
-            <w:r>
-              <w:rPr>
-                <w:rFonts w:ascii="Cambria" w:hAnsi="Cambria"/>
-                <w:b w:val="0"/>
-                <w:i w:val="0"/>
-                <w:color w:val="808080"/>
-                <w:sz w:val="18"/>
-              </w:rPr>
-              <w:t>65%</w:t>
-            </w:r>
-          </w:p>
-        </w:tc>
-        <w:tc>
-          <w:tcPr>
-            <w:tcBorders>
-              <w:top w:val="single" w:sz="2" w:color="B0B8C8"/>
-              <w:left w:val="single" w:sz="2" w:color="B0B8C8"/>
-              <w:bottom w:val="single" w:sz="2" w:color="B0B8C8"/>
-              <w:right w:val="single" w:sz="2" w:color="B0B8C8"/>
-            </w:tcBorders>
-            <w:tcW w:w="800" w:type="dxa"/>
-          </w:tcPr>
-          <w:p>
-            <w:pPr>
-              <w:spacing w:before="60" w:after="60"/>
-            </w:pPr>
-            <w:r/>
-            <w:r>
-              <w:rPr>
-                <w:rFonts w:ascii="Cambria" w:hAnsi="Cambria"/>
-                <w:b w:val="0"/>
-                <w:i w:val="0"/>
-                <w:color w:val="17365D"/>
-                <w:sz w:val="18"/>
-              </w:rPr>
-              <w:t>55%</w:t>
-            </w:r>
-          </w:p>
-        </w:tc>
-        <w:tc>
-          <w:tcPr>
-            <w:tcBorders>
-              <w:top w:val="single" w:sz="2" w:color="B0B8C8"/>
-              <w:left w:val="single" w:sz="2" w:color="B0B8C8"/>
-              <w:bottom w:val="single" w:sz="2" w:color="B0B8C8"/>
-              <w:right w:val="single" w:sz="2" w:color="B0B8C8"/>
-            </w:tcBorders>
-            <w:tcW w:w="1300" w:type="dxa"/>
-          </w:tcPr>
-          <w:p>
-            <w:pPr>
-              <w:spacing w:before="60" w:after="60"/>
-            </w:pPr>
-            <w:r/>
-            <w:r>
-              <w:rPr>
-                <w:rFonts w:ascii="Cambria" w:hAnsi="Cambria"/>
-                <w:b/>
-                <w:i w:val="0"/>
-                <w:color w:val="A6231F"/>
-                <w:sz w:val="18"/>
-              </w:rPr>
-              <w:t>BUY NO</w:t>
-            </w:r>
-          </w:p>
-        </w:tc>
-        <w:tc>
-          <w:tcPr>
-            <w:tcBorders>
-              <w:top w:val="single" w:sz="2" w:color="B0B8C8"/>
-              <w:left w:val="single" w:sz="2" w:color="B0B8C8"/>
-              <w:bottom w:val="single" w:sz="2" w:color="B0B8C8"/>
-              <w:right w:val="single" w:sz="2" w:color="B0B8C8"/>
-            </w:tcBorders>
-            <w:tcW w:w="1000" w:type="dxa"/>
-          </w:tcPr>
-          <w:p>
-            <w:pPr>
-              <w:spacing w:before="60" w:after="60"/>
-            </w:pPr>
-            <w:r/>
-            <w:r>
-              <w:rPr>
-                <w:rFonts w:ascii="Cambria" w:hAnsi="Cambria"/>
-                <w:b w:val="0"/>
-                <w:i w:val="0"/>
-                <w:color w:val="808080"/>
-                <w:sz w:val="18"/>
-              </w:rPr>
-              <w:t>YES</w:t>
-            </w:r>
-          </w:p>
-        </w:tc>
-        <w:tc>
-          <w:tcPr>
-            <w:tcBorders>
-              <w:top w:val="single" w:sz="2" w:color="B0B8C8"/>
-              <w:left w:val="single" w:sz="2" w:color="B0B8C8"/>
-              <w:bottom w:val="single" w:sz="2" w:color="B0B8C8"/>
-              <w:right w:val="single" w:sz="2" w:color="B0B8C8"/>
-            </w:tcBorders>
-            <w:tcW w:w="2100" w:type="dxa"/>
-          </w:tcPr>
-          <w:p>
-            <w:pPr>
-              <w:spacing w:before="60" w:after="60"/>
-            </w:pPr>
-            <w:r/>
-            <w:r>
-              <w:rPr>
-                <w:rFonts w:ascii="Cambria" w:hAnsi="Cambria"/>
-                <w:b/>
-                <w:i w:val="0"/>
-                <w:color w:val="A6231F"/>
-                <w:sz w:val="18"/>
-              </w:rPr>
-              <w:t>✗ Incorrect</w:t>
-            </w:r>
-          </w:p>
-        </w:tc>
-      </w:tr>
     </w:tbl>
     <w:p>
       <w:pPr>

</xml_diff>